<commit_message>
Add CPM guide alignment and blinded review package
</commit_message>
<xml_diff>
--- a/manuscript/computational_particle_mechanics_live_submission_checklist.docx
+++ b/manuscript/computational_particle_mechanics_live_submission_checklist.docx
@@ -374,6 +374,38 @@
           </w:tcPr>
           <w:p>
             <w:r>
+              <w:t>Blinded manuscript if requested</w:t>
+            </w:r>
+          </w:p>
+        </w:tc>
+        <w:tc>
+          <w:tcPr>
+            <w:tcW w:type="dxa" w:w="3264"/>
+          </w:tcPr>
+          <w:p>
+            <w:r>
+              <w:t>Use computational_particle_mechanics_blinded_review_optional.zip only if the live system requests a blinded manuscript for double-anonymized review.</w:t>
+            </w:r>
+          </w:p>
+        </w:tc>
+      </w:tr>
+      <w:tr>
+        <w:tc>
+          <w:tcPr>
+            <w:tcW w:type="dxa" w:w="3264"/>
+          </w:tcPr>
+          <w:p>
+            <w:r>
+              <w:t>[ ]</w:t>
+            </w:r>
+          </w:p>
+        </w:tc>
+        <w:tc>
+          <w:tcPr>
+            <w:tcW w:type="dxa" w:w="3264"/>
+          </w:tcPr>
+          <w:p>
+            <w:r>
               <w:t>LaTeX source</w:t>
             </w:r>
           </w:p>

</xml_diff>